<commit_message>
Completed all presets Completed the results table
</commit_message>
<xml_diff>
--- a/final_report/Report.docx
+++ b/final_report/Report.docx
@@ -7097,26 +7097,441 @@
           <w:szCs w:val="28"/>
         </w:rPr>
       </w:pPr>
-      <w:r>
-        <w:rPr>
-          <w:sz w:val="28"/>
-          <w:szCs w:val="28"/>
-        </w:rPr>
-        <w:t>&lt;</w:t>
-      </w:r>
-      <w:r>
-        <w:rPr>
-          <w:sz w:val="28"/>
-          <w:szCs w:val="28"/>
-        </w:rPr>
-        <w:t>сводная таблица с данными, комментарии</w:t>
-      </w:r>
-      <w:r>
-        <w:rPr>
-          <w:sz w:val="28"/>
-          <w:szCs w:val="28"/>
-        </w:rPr>
-        <w:t>&gt;</w:t>
+    </w:p>
+    <w:p>
+      <w:pPr>
+        <w:rPr>
+          <w:sz w:val="28"/>
+          <w:szCs w:val="28"/>
+        </w:rPr>
+      </w:pPr>
+      <w:r>
+        <w:rPr>
+          <w:sz w:val="28"/>
+          <w:szCs w:val="28"/>
+        </w:rPr>
+        <w:lastRenderedPageBreak/>
+        <w:t>Все метрики были изучены и взяты во внимание при анализе данных, однако в качестве финального результата в сводную таблицу были добавлены:</w:t>
+      </w:r>
+    </w:p>
+    <w:p>
+      <w:pPr>
+        <w:pStyle w:val="a3"/>
+        <w:numPr>
+          <w:ilvl w:val="0"/>
+          <w:numId w:val="10"/>
+        </w:numPr>
+        <w:rPr>
+          <w:sz w:val="28"/>
+          <w:szCs w:val="28"/>
+        </w:rPr>
+      </w:pPr>
+      <w:r>
+        <w:rPr>
+          <w:sz w:val="28"/>
+          <w:szCs w:val="28"/>
+        </w:rPr>
+        <w:t>количество обработанных запросов в секунду</w:t>
+      </w:r>
+    </w:p>
+    <w:p>
+      <w:pPr>
+        <w:pStyle w:val="a3"/>
+        <w:numPr>
+          <w:ilvl w:val="0"/>
+          <w:numId w:val="10"/>
+        </w:numPr>
+        <w:rPr>
+          <w:sz w:val="28"/>
+          <w:szCs w:val="28"/>
+        </w:rPr>
+      </w:pPr>
+      <w:r>
+        <w:rPr>
+          <w:sz w:val="28"/>
+          <w:szCs w:val="28"/>
+        </w:rPr>
+        <w:t>медианная латентность</w:t>
+      </w:r>
+    </w:p>
+    <w:p>
+      <w:pPr>
+        <w:pStyle w:val="a3"/>
+        <w:numPr>
+          <w:ilvl w:val="0"/>
+          <w:numId w:val="10"/>
+        </w:numPr>
+        <w:rPr>
+          <w:sz w:val="28"/>
+          <w:szCs w:val="28"/>
+        </w:rPr>
+      </w:pPr>
+      <w:r>
+        <w:rPr>
+          <w:sz w:val="28"/>
+          <w:szCs w:val="28"/>
+        </w:rPr>
+        <w:t>средняя латентность</w:t>
+      </w:r>
+    </w:p>
+    <w:p>
+      <w:pPr>
+        <w:pStyle w:val="a3"/>
+        <w:numPr>
+          <w:ilvl w:val="0"/>
+          <w:numId w:val="10"/>
+        </w:numPr>
+        <w:rPr>
+          <w:sz w:val="28"/>
+          <w:szCs w:val="28"/>
+        </w:rPr>
+      </w:pPr>
+      <w:r>
+        <w:rPr>
+          <w:sz w:val="28"/>
+          <w:szCs w:val="28"/>
+        </w:rPr>
+        <w:t xml:space="preserve">латентность </w:t>
+      </w:r>
+      <w:r>
+        <w:rPr>
+          <w:sz w:val="28"/>
+          <w:szCs w:val="28"/>
+          <w:lang w:val="en-US"/>
+        </w:rPr>
+        <w:t>p</w:t>
+      </w:r>
+      <w:r>
+        <w:rPr>
+          <w:sz w:val="28"/>
+          <w:szCs w:val="28"/>
+        </w:rPr>
+        <w:t>95</w:t>
+      </w:r>
+    </w:p>
+    <w:p>
+      <w:pPr>
+        <w:pStyle w:val="a3"/>
+        <w:numPr>
+          <w:ilvl w:val="0"/>
+          <w:numId w:val="10"/>
+        </w:numPr>
+        <w:rPr>
+          <w:sz w:val="28"/>
+          <w:szCs w:val="28"/>
+        </w:rPr>
+      </w:pPr>
+      <w:r>
+        <w:rPr>
+          <w:sz w:val="28"/>
+          <w:szCs w:val="28"/>
+        </w:rPr>
+        <w:t xml:space="preserve">латентность </w:t>
+      </w:r>
+      <w:r>
+        <w:rPr>
+          <w:sz w:val="28"/>
+          <w:szCs w:val="28"/>
+          <w:lang w:val="en-US"/>
+        </w:rPr>
+        <w:t>p</w:t>
+      </w:r>
+      <w:r>
+        <w:rPr>
+          <w:sz w:val="28"/>
+          <w:szCs w:val="28"/>
+        </w:rPr>
+        <w:t>99</w:t>
+      </w:r>
+    </w:p>
+    <w:p>
+      <w:pPr>
+        <w:pStyle w:val="a3"/>
+        <w:numPr>
+          <w:ilvl w:val="0"/>
+          <w:numId w:val="10"/>
+        </w:numPr>
+        <w:rPr>
+          <w:sz w:val="28"/>
+          <w:szCs w:val="28"/>
+        </w:rPr>
+      </w:pPr>
+      <w:r>
+        <w:rPr>
+          <w:sz w:val="28"/>
+          <w:szCs w:val="28"/>
+          <w:lang w:val="en-US"/>
+        </w:rPr>
+        <w:t>disparity</w:t>
+      </w:r>
+      <w:r>
+        <w:rPr>
+          <w:sz w:val="28"/>
+          <w:szCs w:val="28"/>
+        </w:rPr>
+        <w:t xml:space="preserve"> </w:t>
+      </w:r>
+      <w:r>
+        <w:rPr>
+          <w:sz w:val="28"/>
+          <w:szCs w:val="28"/>
+        </w:rPr>
+        <w:t>–</w:t>
+      </w:r>
+      <w:r>
+        <w:rPr>
+          <w:sz w:val="28"/>
+          <w:szCs w:val="28"/>
+        </w:rPr>
+        <w:t xml:space="preserve"> </w:t>
+      </w:r>
+      <w:r>
+        <w:rPr>
+          <w:sz w:val="28"/>
+          <w:szCs w:val="28"/>
+        </w:rPr>
+        <w:t>метрика неравномерности нагрузки серверов</w:t>
+      </w:r>
+      <w:r>
+        <w:rPr>
+          <w:sz w:val="28"/>
+          <w:szCs w:val="28"/>
+        </w:rPr>
+        <w:t xml:space="preserve">, </w:t>
+      </w:r>
+      <w:r>
+        <w:rPr>
+          <w:sz w:val="28"/>
+          <w:szCs w:val="28"/>
+        </w:rPr>
+        <w:t xml:space="preserve">считается по формуле: </w:t>
+      </w:r>
+      <w:r>
+        <w:rPr>
+          <w:sz w:val="28"/>
+          <w:szCs w:val="28"/>
+          <w:lang w:val="en-US"/>
+        </w:rPr>
+        <w:t>standard</w:t>
+      </w:r>
+      <w:r>
+        <w:rPr>
+          <w:sz w:val="28"/>
+          <w:szCs w:val="28"/>
+        </w:rPr>
+        <w:t>_</w:t>
+      </w:r>
+      <w:r>
+        <w:rPr>
+          <w:sz w:val="28"/>
+          <w:szCs w:val="28"/>
+          <w:lang w:val="en-US"/>
+        </w:rPr>
+        <w:t>deviation</w:t>
+      </w:r>
+      <w:r>
+        <w:rPr>
+          <w:sz w:val="28"/>
+          <w:szCs w:val="28"/>
+        </w:rPr>
+        <w:t>(</w:t>
+      </w:r>
+      <w:r>
+        <w:rPr>
+          <w:sz w:val="28"/>
+          <w:szCs w:val="28"/>
+          <w:lang w:val="en-US"/>
+        </w:rPr>
+        <w:t>avg</w:t>
+      </w:r>
+      <w:r>
+        <w:rPr>
+          <w:sz w:val="28"/>
+          <w:szCs w:val="28"/>
+        </w:rPr>
+        <w:t>_</w:t>
+      </w:r>
+      <w:r>
+        <w:rPr>
+          <w:sz w:val="28"/>
+          <w:szCs w:val="28"/>
+          <w:lang w:val="en-US"/>
+        </w:rPr>
+        <w:t>loads</w:t>
+      </w:r>
+      <w:r>
+        <w:rPr>
+          <w:sz w:val="28"/>
+          <w:szCs w:val="28"/>
+        </w:rPr>
+        <w:t>)</w:t>
+      </w:r>
+      <w:r>
+        <w:rPr>
+          <w:sz w:val="28"/>
+          <w:szCs w:val="28"/>
+        </w:rPr>
+        <w:t xml:space="preserve"> / </w:t>
+      </w:r>
+      <w:r>
+        <w:rPr>
+          <w:sz w:val="28"/>
+          <w:szCs w:val="28"/>
+          <w:lang w:val="en-US"/>
+        </w:rPr>
+        <w:t>m</w:t>
+      </w:r>
+      <w:r>
+        <w:rPr>
+          <w:sz w:val="28"/>
+          <w:szCs w:val="28"/>
+          <w:lang w:val="en-US"/>
+        </w:rPr>
+        <w:t>ean</w:t>
+      </w:r>
+      <w:r>
+        <w:rPr>
+          <w:sz w:val="28"/>
+          <w:szCs w:val="28"/>
+        </w:rPr>
+        <w:t>(</w:t>
+      </w:r>
+      <w:r>
+        <w:rPr>
+          <w:sz w:val="28"/>
+          <w:szCs w:val="28"/>
+          <w:lang w:val="en-US"/>
+        </w:rPr>
+        <w:t>avg</w:t>
+      </w:r>
+      <w:r>
+        <w:rPr>
+          <w:sz w:val="28"/>
+          <w:szCs w:val="28"/>
+        </w:rPr>
+        <w:t>_</w:t>
+      </w:r>
+      <w:r>
+        <w:rPr>
+          <w:sz w:val="28"/>
+          <w:szCs w:val="28"/>
+          <w:lang w:val="en-US"/>
+        </w:rPr>
+        <w:t>load</w:t>
+      </w:r>
+      <w:r>
+        <w:rPr>
+          <w:sz w:val="28"/>
+          <w:szCs w:val="28"/>
+          <w:lang w:val="en-US"/>
+        </w:rPr>
+        <w:t>s</w:t>
+      </w:r>
+      <w:r>
+        <w:rPr>
+          <w:sz w:val="28"/>
+          <w:szCs w:val="28"/>
+        </w:rPr>
+        <w:t>)</w:t>
+      </w:r>
+    </w:p>
+    <w:p>
+      <w:pPr>
+        <w:pStyle w:val="a3"/>
+        <w:rPr>
+          <w:sz w:val="28"/>
+          <w:szCs w:val="28"/>
+        </w:rPr>
+      </w:pPr>
+      <w:r>
+        <w:rPr>
+          <w:sz w:val="28"/>
+          <w:szCs w:val="28"/>
+        </w:rPr>
+        <w:t>чем больше величина, тем менее равномерно распределена нагрузка</w:t>
+      </w:r>
+    </w:p>
+    <w:p>
+      <w:pPr>
+        <w:rPr>
+          <w:sz w:val="28"/>
+          <w:szCs w:val="28"/>
+        </w:rPr>
+      </w:pPr>
+      <w:r>
+        <w:rPr>
+          <w:sz w:val="28"/>
+          <w:szCs w:val="28"/>
+        </w:rPr>
+        <w:t xml:space="preserve">Сводная таблица находится в </w:t>
+      </w:r>
+      <w:r>
+        <w:rPr>
+          <w:sz w:val="28"/>
+          <w:szCs w:val="28"/>
+          <w:lang w:val="en-US"/>
+        </w:rPr>
+        <w:t>final</w:t>
+      </w:r>
+      <w:r>
+        <w:rPr>
+          <w:sz w:val="28"/>
+          <w:szCs w:val="28"/>
+        </w:rPr>
+        <w:t>_</w:t>
+      </w:r>
+      <w:r>
+        <w:rPr>
+          <w:sz w:val="28"/>
+          <w:szCs w:val="28"/>
+          <w:lang w:val="en-US"/>
+        </w:rPr>
+        <w:t>reports</w:t>
+      </w:r>
+      <w:r>
+        <w:rPr>
+          <w:sz w:val="28"/>
+          <w:szCs w:val="28"/>
+        </w:rPr>
+        <w:t>/</w:t>
+      </w:r>
+      <w:r>
+        <w:rPr>
+          <w:sz w:val="28"/>
+          <w:szCs w:val="28"/>
+          <w:lang w:val="en-US"/>
+        </w:rPr>
+        <w:t>Results</w:t>
+      </w:r>
+      <w:r>
+        <w:rPr>
+          <w:sz w:val="28"/>
+          <w:szCs w:val="28"/>
+        </w:rPr>
+        <w:t>.</w:t>
+      </w:r>
+      <w:r>
+        <w:rPr>
+          <w:sz w:val="28"/>
+          <w:szCs w:val="28"/>
+          <w:lang w:val="en-US"/>
+        </w:rPr>
+        <w:t>xlsx</w:t>
+      </w:r>
+      <w:r>
+        <w:rPr>
+          <w:sz w:val="28"/>
+          <w:szCs w:val="28"/>
+        </w:rPr>
+        <w:t>.</w:t>
+      </w:r>
+      <w:r>
+        <w:rPr>
+          <w:sz w:val="28"/>
+          <w:szCs w:val="28"/>
+        </w:rPr>
+        <w:br/>
+        <w:t>Данные про каждый алгоритм находятся на соответствующим им страницам таблицы.</w:t>
       </w:r>
     </w:p>
     <w:p>
@@ -7133,7 +7548,6 @@
           <w:szCs w:val="36"/>
           <w:u w:val="single"/>
         </w:rPr>
-        <w:lastRenderedPageBreak/>
         <w:t>Анализ данных и в</w:t>
       </w:r>
       <w:r>
@@ -7157,21 +7571,302 @@
           <w:sz w:val="28"/>
           <w:szCs w:val="28"/>
         </w:rPr>
-        <w:t>&lt;</w:t>
-      </w:r>
-      <w:r>
-        <w:rPr>
-          <w:sz w:val="28"/>
-          <w:szCs w:val="28"/>
-        </w:rPr>
-        <w:t>выводы про правильность гипотез и реальные данные</w:t>
-      </w:r>
-      <w:r>
-        <w:rPr>
-          <w:sz w:val="28"/>
-          <w:szCs w:val="28"/>
-        </w:rPr>
-        <w:t>&gt;</w:t>
+        <w:t>В результате анализа данных, некоторые гипотезы подтвердились, а некоторые были опровергнуты.</w:t>
+      </w:r>
+    </w:p>
+    <w:p>
+      <w:pPr>
+        <w:rPr>
+          <w:sz w:val="28"/>
+          <w:szCs w:val="28"/>
+        </w:rPr>
+      </w:pPr>
+      <w:r>
+        <w:rPr>
+          <w:sz w:val="28"/>
+          <w:szCs w:val="28"/>
+          <w:lang w:val="en-US"/>
+        </w:rPr>
+        <w:t>RR</w:t>
+      </w:r>
+      <w:r>
+        <w:rPr>
+          <w:sz w:val="28"/>
+          <w:szCs w:val="28"/>
+        </w:rPr>
+        <w:t xml:space="preserve"> </w:t>
+      </w:r>
+      <w:r>
+        <w:rPr>
+          <w:sz w:val="28"/>
+          <w:szCs w:val="28"/>
+        </w:rPr>
+        <w:t>эффективен на простых задачах</w:t>
+      </w:r>
+      <w:r>
+        <w:rPr>
+          <w:sz w:val="28"/>
+          <w:szCs w:val="28"/>
+        </w:rPr>
+        <w:br/>
+      </w:r>
+      <w:r>
+        <w:rPr>
+          <w:sz w:val="28"/>
+          <w:szCs w:val="28"/>
+          <w:lang w:val="en-US"/>
+        </w:rPr>
+        <w:t>RR</w:t>
+      </w:r>
+      <w:r>
+        <w:rPr>
+          <w:sz w:val="28"/>
+          <w:szCs w:val="28"/>
+        </w:rPr>
+        <w:t xml:space="preserve"> </w:t>
+      </w:r>
+      <w:r>
+        <w:rPr>
+          <w:sz w:val="28"/>
+          <w:szCs w:val="28"/>
+        </w:rPr>
+        <w:t>неэффективен на сложных</w:t>
+      </w:r>
+    </w:p>
+    <w:p>
+      <w:pPr>
+        <w:rPr>
+          <w:sz w:val="28"/>
+          <w:szCs w:val="28"/>
+        </w:rPr>
+      </w:pPr>
+      <w:r>
+        <w:rPr>
+          <w:sz w:val="28"/>
+          <w:szCs w:val="28"/>
+          <w:lang w:val="en-US"/>
+        </w:rPr>
+        <w:t>WRR</w:t>
+      </w:r>
+      <w:r>
+        <w:rPr>
+          <w:sz w:val="28"/>
+          <w:szCs w:val="28"/>
+        </w:rPr>
+        <w:t xml:space="preserve"> </w:t>
+      </w:r>
+      <w:r>
+        <w:rPr>
+          <w:sz w:val="28"/>
+          <w:szCs w:val="28"/>
+        </w:rPr>
+        <w:t>эффективен на простых задач и средних задачах</w:t>
+      </w:r>
+      <w:r>
+        <w:rPr>
+          <w:sz w:val="28"/>
+          <w:szCs w:val="28"/>
+        </w:rPr>
+        <w:br/>
+      </w:r>
+      <w:r>
+        <w:rPr>
+          <w:sz w:val="28"/>
+          <w:szCs w:val="28"/>
+          <w:lang w:val="en-US"/>
+        </w:rPr>
+        <w:t>WRR</w:t>
+      </w:r>
+      <w:r>
+        <w:rPr>
+          <w:sz w:val="28"/>
+          <w:szCs w:val="28"/>
+        </w:rPr>
+        <w:t xml:space="preserve"> </w:t>
+      </w:r>
+      <w:r>
+        <w:rPr>
+          <w:sz w:val="28"/>
+          <w:szCs w:val="28"/>
+        </w:rPr>
+        <w:t>на самом деле довольно эффективен и на сложных</w:t>
+      </w:r>
+    </w:p>
+    <w:p>
+      <w:pPr>
+        <w:rPr>
+          <w:sz w:val="28"/>
+          <w:szCs w:val="28"/>
+        </w:rPr>
+      </w:pPr>
+      <w:r>
+        <w:rPr>
+          <w:sz w:val="28"/>
+          <w:szCs w:val="28"/>
+          <w:lang w:val="en-US"/>
+        </w:rPr>
+        <w:t>LC</w:t>
+      </w:r>
+      <w:r>
+        <w:rPr>
+          <w:sz w:val="28"/>
+          <w:szCs w:val="28"/>
+        </w:rPr>
+        <w:t xml:space="preserve"> </w:t>
+      </w:r>
+      <w:r>
+        <w:rPr>
+          <w:sz w:val="28"/>
+          <w:szCs w:val="28"/>
+        </w:rPr>
+        <w:t>не так сильно отстаёт по эффективности на простых задачах</w:t>
+      </w:r>
+      <w:r>
+        <w:rPr>
+          <w:sz w:val="28"/>
+          <w:szCs w:val="28"/>
+        </w:rPr>
+        <w:br/>
+      </w:r>
+      <w:r>
+        <w:rPr>
+          <w:sz w:val="28"/>
+          <w:szCs w:val="28"/>
+          <w:lang w:val="en-US"/>
+        </w:rPr>
+        <w:t>LC</w:t>
+      </w:r>
+      <w:r>
+        <w:rPr>
+          <w:sz w:val="28"/>
+          <w:szCs w:val="28"/>
+        </w:rPr>
+        <w:t xml:space="preserve"> </w:t>
+      </w:r>
+      <w:r>
+        <w:rPr>
+          <w:sz w:val="28"/>
+          <w:szCs w:val="28"/>
+        </w:rPr>
+        <w:t>действительно хорош на сложных задачах</w:t>
+      </w:r>
+      <w:r>
+        <w:rPr>
+          <w:sz w:val="28"/>
+          <w:szCs w:val="28"/>
+        </w:rPr>
+        <w:t xml:space="preserve"> НО</w:t>
+      </w:r>
+      <w:r>
+        <w:rPr>
+          <w:sz w:val="28"/>
+          <w:szCs w:val="28"/>
+        </w:rPr>
+        <w:br/>
+      </w:r>
+      <w:r>
+        <w:rPr>
+          <w:sz w:val="28"/>
+          <w:szCs w:val="28"/>
+          <w:lang w:val="en-US"/>
+        </w:rPr>
+        <w:t>LC</w:t>
+      </w:r>
+      <w:r>
+        <w:rPr>
+          <w:sz w:val="28"/>
+          <w:szCs w:val="28"/>
+        </w:rPr>
+        <w:t xml:space="preserve"> </w:t>
+      </w:r>
+      <w:r>
+        <w:rPr>
+          <w:sz w:val="28"/>
+          <w:szCs w:val="28"/>
+        </w:rPr>
+        <w:t>имеет свойство перегружать самый слабый сервер!</w:t>
+      </w:r>
+    </w:p>
+    <w:p>
+      <w:pPr>
+        <w:rPr>
+          <w:sz w:val="28"/>
+          <w:szCs w:val="28"/>
+        </w:rPr>
+      </w:pPr>
+      <w:r>
+        <w:rPr>
+          <w:sz w:val="28"/>
+          <w:szCs w:val="28"/>
+          <w:lang w:val="en-US"/>
+        </w:rPr>
+        <w:t>CH</w:t>
+      </w:r>
+      <w:r>
+        <w:rPr>
+          <w:sz w:val="28"/>
+          <w:szCs w:val="28"/>
+        </w:rPr>
+        <w:t xml:space="preserve"> иногда</w:t>
+      </w:r>
+      <w:r>
+        <w:rPr>
+          <w:sz w:val="28"/>
+          <w:szCs w:val="28"/>
+        </w:rPr>
+        <w:t xml:space="preserve"> </w:t>
+      </w:r>
+      <w:r>
+        <w:rPr>
+          <w:sz w:val="28"/>
+          <w:szCs w:val="28"/>
+        </w:rPr>
+        <w:t>работает</w:t>
+      </w:r>
+      <w:r>
+        <w:rPr>
+          <w:sz w:val="28"/>
+          <w:szCs w:val="28"/>
+        </w:rPr>
+        <w:t xml:space="preserve"> плохо из-за неудачного хэширования, но </w:t>
+      </w:r>
+      <w:r>
+        <w:rPr>
+          <w:sz w:val="28"/>
+          <w:szCs w:val="28"/>
+          <w:lang w:val="en-US"/>
+        </w:rPr>
+        <w:t>stickiness</w:t>
+      </w:r>
+      <w:r>
+        <w:rPr>
+          <w:sz w:val="28"/>
+          <w:szCs w:val="28"/>
+        </w:rPr>
+        <w:t xml:space="preserve"> </w:t>
+      </w:r>
+      <w:r>
+        <w:rPr>
+          <w:sz w:val="28"/>
+          <w:szCs w:val="28"/>
+          <w:lang w:val="en-US"/>
+        </w:rPr>
+        <w:t>is</w:t>
+      </w:r>
+      <w:r>
+        <w:rPr>
+          <w:sz w:val="28"/>
+          <w:szCs w:val="28"/>
+        </w:rPr>
+        <w:t xml:space="preserve"> </w:t>
+      </w:r>
+      <w:r>
+        <w:rPr>
+          <w:sz w:val="28"/>
+          <w:szCs w:val="28"/>
+          <w:lang w:val="en-US"/>
+        </w:rPr>
+        <w:t>respected</w:t>
       </w:r>
     </w:p>
     <w:p>
@@ -7364,6 +8059,7 @@
           <w:sz w:val="28"/>
           <w:szCs w:val="28"/>
         </w:rPr>
+        <w:lastRenderedPageBreak/>
         <w:t xml:space="preserve">Кулаковский Влад Андреевич - Platform Core &amp; </w:t>
       </w:r>
       <w:proofErr w:type="spellStart"/>
@@ -8459,6 +9155,119 @@
     </w:lvl>
   </w:abstractNum>
   <w:abstractNum w:abstractNumId="5" w15:restartNumberingAfterBreak="0">
+    <w:nsid w:val="4AE043D3"/>
+    <w:multiLevelType w:val="hybridMultilevel"/>
+    <w:tmpl w:val="ADDECFC4"/>
+    <w:lvl w:ilvl="0" w:tplc="04190001">
+      <w:start w:val="1"/>
+      <w:numFmt w:val="bullet"/>
+      <w:lvlText w:val=""/>
+      <w:lvlJc w:val="left"/>
+      <w:pPr>
+        <w:ind w:left="720" w:hanging="360"/>
+      </w:pPr>
+      <w:rPr>
+        <w:rFonts w:ascii="Symbol" w:hAnsi="Symbol" w:hint="default"/>
+      </w:rPr>
+    </w:lvl>
+    <w:lvl w:ilvl="1" w:tplc="04190003" w:tentative="1">
+      <w:start w:val="1"/>
+      <w:numFmt w:val="bullet"/>
+      <w:lvlText w:val="o"/>
+      <w:lvlJc w:val="left"/>
+      <w:pPr>
+        <w:ind w:left="1440" w:hanging="360"/>
+      </w:pPr>
+      <w:rPr>
+        <w:rFonts w:ascii="Courier New" w:hAnsi="Courier New" w:cs="Courier New" w:hint="default"/>
+      </w:rPr>
+    </w:lvl>
+    <w:lvl w:ilvl="2" w:tplc="04190005" w:tentative="1">
+      <w:start w:val="1"/>
+      <w:numFmt w:val="bullet"/>
+      <w:lvlText w:val=""/>
+      <w:lvlJc w:val="left"/>
+      <w:pPr>
+        <w:ind w:left="2160" w:hanging="360"/>
+      </w:pPr>
+      <w:rPr>
+        <w:rFonts w:ascii="Wingdings" w:hAnsi="Wingdings" w:hint="default"/>
+      </w:rPr>
+    </w:lvl>
+    <w:lvl w:ilvl="3" w:tplc="04190001" w:tentative="1">
+      <w:start w:val="1"/>
+      <w:numFmt w:val="bullet"/>
+      <w:lvlText w:val=""/>
+      <w:lvlJc w:val="left"/>
+      <w:pPr>
+        <w:ind w:left="2880" w:hanging="360"/>
+      </w:pPr>
+      <w:rPr>
+        <w:rFonts w:ascii="Symbol" w:hAnsi="Symbol" w:hint="default"/>
+      </w:rPr>
+    </w:lvl>
+    <w:lvl w:ilvl="4" w:tplc="04190003" w:tentative="1">
+      <w:start w:val="1"/>
+      <w:numFmt w:val="bullet"/>
+      <w:lvlText w:val="o"/>
+      <w:lvlJc w:val="left"/>
+      <w:pPr>
+        <w:ind w:left="3600" w:hanging="360"/>
+      </w:pPr>
+      <w:rPr>
+        <w:rFonts w:ascii="Courier New" w:hAnsi="Courier New" w:cs="Courier New" w:hint="default"/>
+      </w:rPr>
+    </w:lvl>
+    <w:lvl w:ilvl="5" w:tplc="04190005" w:tentative="1">
+      <w:start w:val="1"/>
+      <w:numFmt w:val="bullet"/>
+      <w:lvlText w:val=""/>
+      <w:lvlJc w:val="left"/>
+      <w:pPr>
+        <w:ind w:left="4320" w:hanging="360"/>
+      </w:pPr>
+      <w:rPr>
+        <w:rFonts w:ascii="Wingdings" w:hAnsi="Wingdings" w:hint="default"/>
+      </w:rPr>
+    </w:lvl>
+    <w:lvl w:ilvl="6" w:tplc="04190001" w:tentative="1">
+      <w:start w:val="1"/>
+      <w:numFmt w:val="bullet"/>
+      <w:lvlText w:val=""/>
+      <w:lvlJc w:val="left"/>
+      <w:pPr>
+        <w:ind w:left="5040" w:hanging="360"/>
+      </w:pPr>
+      <w:rPr>
+        <w:rFonts w:ascii="Symbol" w:hAnsi="Symbol" w:hint="default"/>
+      </w:rPr>
+    </w:lvl>
+    <w:lvl w:ilvl="7" w:tplc="04190003" w:tentative="1">
+      <w:start w:val="1"/>
+      <w:numFmt w:val="bullet"/>
+      <w:lvlText w:val="o"/>
+      <w:lvlJc w:val="left"/>
+      <w:pPr>
+        <w:ind w:left="5760" w:hanging="360"/>
+      </w:pPr>
+      <w:rPr>
+        <w:rFonts w:ascii="Courier New" w:hAnsi="Courier New" w:cs="Courier New" w:hint="default"/>
+      </w:rPr>
+    </w:lvl>
+    <w:lvl w:ilvl="8" w:tplc="04190005" w:tentative="1">
+      <w:start w:val="1"/>
+      <w:numFmt w:val="bullet"/>
+      <w:lvlText w:val=""/>
+      <w:lvlJc w:val="left"/>
+      <w:pPr>
+        <w:ind w:left="6480" w:hanging="360"/>
+      </w:pPr>
+      <w:rPr>
+        <w:rFonts w:ascii="Wingdings" w:hAnsi="Wingdings" w:hint="default"/>
+      </w:rPr>
+    </w:lvl>
+  </w:abstractNum>
+  <w:abstractNum w:abstractNumId="6" w15:restartNumberingAfterBreak="0">
     <w:nsid w:val="52264E63"/>
     <w:multiLevelType w:val="hybridMultilevel"/>
     <w:tmpl w:val="1CE4BB30"/>
@@ -8571,7 +9380,7 @@
       </w:rPr>
     </w:lvl>
   </w:abstractNum>
-  <w:abstractNum w:abstractNumId="6" w15:restartNumberingAfterBreak="0">
+  <w:abstractNum w:abstractNumId="7" w15:restartNumberingAfterBreak="0">
     <w:nsid w:val="66C572F9"/>
     <w:multiLevelType w:val="hybridMultilevel"/>
     <w:tmpl w:val="0D9A2F64"/>
@@ -8684,7 +9493,7 @@
       </w:rPr>
     </w:lvl>
   </w:abstractNum>
-  <w:abstractNum w:abstractNumId="7" w15:restartNumberingAfterBreak="0">
+  <w:abstractNum w:abstractNumId="8" w15:restartNumberingAfterBreak="0">
     <w:nsid w:val="684B5A8D"/>
     <w:multiLevelType w:val="hybridMultilevel"/>
     <w:tmpl w:val="4A481BE2"/>
@@ -8797,7 +9606,7 @@
       </w:rPr>
     </w:lvl>
   </w:abstractNum>
-  <w:abstractNum w:abstractNumId="8" w15:restartNumberingAfterBreak="0">
+  <w:abstractNum w:abstractNumId="9" w15:restartNumberingAfterBreak="0">
     <w:nsid w:val="775B2538"/>
     <w:multiLevelType w:val="hybridMultilevel"/>
     <w:tmpl w:val="BE7AC3BC"/>
@@ -8914,16 +9723,16 @@
     <w:abstractNumId w:val="2"/>
   </w:num>
   <w:num w:numId="2">
-    <w:abstractNumId w:val="5"/>
+    <w:abstractNumId w:val="6"/>
   </w:num>
   <w:num w:numId="3">
-    <w:abstractNumId w:val="6"/>
+    <w:abstractNumId w:val="7"/>
   </w:num>
   <w:num w:numId="4">
     <w:abstractNumId w:val="1"/>
   </w:num>
   <w:num w:numId="5">
-    <w:abstractNumId w:val="7"/>
+    <w:abstractNumId w:val="8"/>
   </w:num>
   <w:num w:numId="6">
     <w:abstractNumId w:val="0"/>
@@ -8935,7 +9744,10 @@
     <w:abstractNumId w:val="3"/>
   </w:num>
   <w:num w:numId="9">
-    <w:abstractNumId w:val="8"/>
+    <w:abstractNumId w:val="9"/>
+  </w:num>
+  <w:num w:numId="10">
+    <w:abstractNumId w:val="5"/>
   </w:num>
 </w:numbering>
 </file>

</xml_diff>